<commit_message>
progress wireframe & tambah
</commit_message>
<xml_diff>
--- a/Data/Survey Pengelola.docx
+++ b/Data/Survey Pengelola.docx
@@ -21,10 +21,10 @@
       </w:tblPr>
       <w:tblGrid>
         <w:gridCol w:w="638"/>
-        <w:gridCol w:w="4059"/>
-        <w:gridCol w:w="1350"/>
-        <w:gridCol w:w="1337"/>
-        <w:gridCol w:w="1632"/>
+        <w:gridCol w:w="3998"/>
+        <w:gridCol w:w="1341"/>
+        <w:gridCol w:w="1331"/>
+        <w:gridCol w:w="1708"/>
       </w:tblGrid>
       <w:tr>
         <w:trPr>
@@ -61,25 +61,10 @@
                 <w:sz w:val="24"/>
                 <w:szCs w:val="24"/>
               </w:rPr>
-              <w:t xml:space="preserve">Nama Responden : </w:t>
-            </w:r>
-          </w:p>
-        </w:tc>
-        <w:tc>
-          <w:tcPr>
-            <w:tcW w:w="0" w:type="auto"/>
-            <w:gridSpan w:val="2"/>
-            <w:tcMar>
-              <w:top w:w="30" w:type="dxa"/>
-              <w:left w:w="45" w:type="dxa"/>
-              <w:bottom w:w="30" w:type="dxa"/>
-              <w:right w:w="45" w:type="dxa"/>
-            </w:tcMar>
-            <w:vAlign w:val="bottom"/>
-            <w:hideMark/>
-          </w:tcPr>
-          <w:p>
-            <w:pPr>
+              <w:t xml:space="preserve">Nama </w:t>
+            </w:r>
+            <w:proofErr w:type="spellStart"/>
+            <w:r>
               <w:rPr>
                 <w:rFonts w:ascii="Times New Roman" w:hAnsi="Times New Roman" w:cs="Times New Roman"/>
                 <w:b/>
@@ -87,7 +72,9 @@
                 <w:sz w:val="24"/>
                 <w:szCs w:val="24"/>
               </w:rPr>
-            </w:pPr>
+              <w:t>Responden</w:t>
+            </w:r>
+            <w:proofErr w:type="spellEnd"/>
             <w:r>
               <w:rPr>
                 <w:rFonts w:ascii="Times New Roman" w:hAnsi="Times New Roman" w:cs="Times New Roman"/>
@@ -96,9 +83,25 @@
                 <w:sz w:val="24"/>
                 <w:szCs w:val="24"/>
               </w:rPr>
-              <w:t xml:space="preserve">Role : </w:t>
-            </w:r>
-            <w:r>
+              <w:t xml:space="preserve"> : </w:t>
+            </w:r>
+          </w:p>
+        </w:tc>
+        <w:tc>
+          <w:tcPr>
+            <w:tcW w:w="0" w:type="auto"/>
+            <w:gridSpan w:val="2"/>
+            <w:tcMar>
+              <w:top w:w="30" w:type="dxa"/>
+              <w:left w:w="45" w:type="dxa"/>
+              <w:bottom w:w="30" w:type="dxa"/>
+              <w:right w:w="45" w:type="dxa"/>
+            </w:tcMar>
+            <w:vAlign w:val="bottom"/>
+            <w:hideMark/>
+          </w:tcPr>
+          <w:p>
+            <w:pPr>
               <w:rPr>
                 <w:rFonts w:ascii="Times New Roman" w:hAnsi="Times New Roman" w:cs="Times New Roman"/>
                 <w:b/>
@@ -106,8 +109,29 @@
                 <w:sz w:val="24"/>
                 <w:szCs w:val="24"/>
               </w:rPr>
+            </w:pPr>
+            <w:r>
+              <w:rPr>
+                <w:rFonts w:ascii="Times New Roman" w:hAnsi="Times New Roman" w:cs="Times New Roman"/>
+                <w:b/>
+                <w:bCs/>
+                <w:sz w:val="24"/>
+                <w:szCs w:val="24"/>
+              </w:rPr>
+              <w:t xml:space="preserve">Role : </w:t>
+            </w:r>
+            <w:proofErr w:type="spellStart"/>
+            <w:r>
+              <w:rPr>
+                <w:rFonts w:ascii="Times New Roman" w:hAnsi="Times New Roman" w:cs="Times New Roman"/>
+                <w:b/>
+                <w:bCs/>
+                <w:sz w:val="24"/>
+                <w:szCs w:val="24"/>
+              </w:rPr>
               <w:t>Pengelola</w:t>
             </w:r>
+            <w:proofErr w:type="spellEnd"/>
           </w:p>
         </w:tc>
       </w:tr>
@@ -173,6 +197,7 @@
                 <w:szCs w:val="24"/>
               </w:rPr>
             </w:pPr>
+            <w:proofErr w:type="spellStart"/>
             <w:r>
               <w:rPr>
                 <w:rFonts w:ascii="Times New Roman" w:hAnsi="Times New Roman" w:cs="Times New Roman"/>
@@ -181,25 +206,10 @@
                 <w:sz w:val="24"/>
                 <w:szCs w:val="24"/>
               </w:rPr>
-              <w:t>Tugas Pengelola</w:t>
-            </w:r>
-          </w:p>
-        </w:tc>
-        <w:tc>
-          <w:tcPr>
-            <w:tcW w:w="0" w:type="auto"/>
-            <w:tcMar>
-              <w:top w:w="30" w:type="dxa"/>
-              <w:left w:w="45" w:type="dxa"/>
-              <w:bottom w:w="30" w:type="dxa"/>
-              <w:right w:w="45" w:type="dxa"/>
-            </w:tcMar>
-            <w:vAlign w:val="bottom"/>
-            <w:hideMark/>
-          </w:tcPr>
-          <w:p>
-            <w:pPr>
-              <w:jc w:val="center"/>
+              <w:t>Tugas</w:t>
+            </w:r>
+            <w:proofErr w:type="spellEnd"/>
+            <w:r>
               <w:rPr>
                 <w:rFonts w:ascii="Times New Roman" w:hAnsi="Times New Roman" w:cs="Times New Roman"/>
                 <w:b/>
@@ -207,7 +217,9 @@
                 <w:sz w:val="24"/>
                 <w:szCs w:val="24"/>
               </w:rPr>
-            </w:pPr>
+              <w:t xml:space="preserve"> </w:t>
+            </w:r>
+            <w:proofErr w:type="spellStart"/>
             <w:r>
               <w:rPr>
                 <w:rFonts w:ascii="Times New Roman" w:hAnsi="Times New Roman" w:cs="Times New Roman"/>
@@ -216,8 +228,9 @@
                 <w:sz w:val="24"/>
                 <w:szCs w:val="24"/>
               </w:rPr>
-              <w:t>Jumlah Langkah</w:t>
-            </w:r>
+              <w:t>Pengelola</w:t>
+            </w:r>
+            <w:proofErr w:type="spellEnd"/>
           </w:p>
         </w:tc>
         <w:tc>
@@ -243,6 +256,7 @@
                 <w:szCs w:val="24"/>
               </w:rPr>
             </w:pPr>
+            <w:proofErr w:type="spellStart"/>
             <w:r>
               <w:rPr>
                 <w:rFonts w:ascii="Times New Roman" w:hAnsi="Times New Roman" w:cs="Times New Roman"/>
@@ -251,47 +265,113 @@
                 <w:sz w:val="24"/>
                 <w:szCs w:val="24"/>
               </w:rPr>
-              <w:t>Kepuasan (1-5)</w:t>
-            </w:r>
-          </w:p>
-        </w:tc>
-        <w:tc>
-          <w:tcPr>
-            <w:tcW w:w="0" w:type="auto"/>
-            <w:tcMar>
-              <w:top w:w="30" w:type="dxa"/>
-              <w:left w:w="45" w:type="dxa"/>
-              <w:bottom w:w="30" w:type="dxa"/>
-              <w:right w:w="45" w:type="dxa"/>
-            </w:tcMar>
-            <w:vAlign w:val="bottom"/>
-            <w:hideMark/>
-          </w:tcPr>
-          <w:p>
-            <w:pPr>
-              <w:jc w:val="center"/>
+              <w:t>Jumlah</w:t>
+            </w:r>
+            <w:proofErr w:type="spellEnd"/>
+            <w:r>
               <w:rPr>
                 <w:rFonts w:ascii="Times New Roman" w:hAnsi="Times New Roman" w:cs="Times New Roman"/>
                 <w:b/>
                 <w:bCs/>
-                <w:i/>
-                <w:iCs/>
-                <w:sz w:val="24"/>
-                <w:szCs w:val="24"/>
-              </w:rPr>
-            </w:pPr>
-            <w:r>
+                <w:sz w:val="24"/>
+                <w:szCs w:val="24"/>
+              </w:rPr>
+              <w:t xml:space="preserve"> Langkah</w:t>
+            </w:r>
+          </w:p>
+        </w:tc>
+        <w:tc>
+          <w:tcPr>
+            <w:tcW w:w="0" w:type="auto"/>
+            <w:tcMar>
+              <w:top w:w="30" w:type="dxa"/>
+              <w:left w:w="45" w:type="dxa"/>
+              <w:bottom w:w="30" w:type="dxa"/>
+              <w:right w:w="45" w:type="dxa"/>
+            </w:tcMar>
+            <w:vAlign w:val="bottom"/>
+            <w:hideMark/>
+          </w:tcPr>
+          <w:p>
+            <w:pPr>
+              <w:jc w:val="center"/>
               <w:rPr>
                 <w:rFonts w:ascii="Times New Roman" w:hAnsi="Times New Roman" w:cs="Times New Roman"/>
                 <w:b/>
                 <w:bCs/>
-                <w:i/>
-                <w:iCs/>
-                <w:sz w:val="24"/>
-                <w:szCs w:val="24"/>
-              </w:rPr>
-              <w:t>Time Bassed Efficiency</w:t>
-            </w:r>
+                <w:sz w:val="24"/>
+                <w:szCs w:val="24"/>
+              </w:rPr>
+            </w:pPr>
+            <w:proofErr w:type="spellStart"/>
+            <w:r>
+              <w:rPr>
+                <w:rFonts w:ascii="Times New Roman" w:hAnsi="Times New Roman" w:cs="Times New Roman"/>
+                <w:b/>
+                <w:bCs/>
+                <w:sz w:val="24"/>
+                <w:szCs w:val="24"/>
+              </w:rPr>
+              <w:t>Kepuasan</w:t>
+            </w:r>
+            <w:proofErr w:type="spellEnd"/>
+            <w:r>
+              <w:rPr>
+                <w:rFonts w:ascii="Times New Roman" w:hAnsi="Times New Roman" w:cs="Times New Roman"/>
+                <w:b/>
+                <w:bCs/>
+                <w:sz w:val="24"/>
+                <w:szCs w:val="24"/>
+              </w:rPr>
+              <w:t xml:space="preserve"> (1-5)</w:t>
+            </w:r>
+          </w:p>
+        </w:tc>
+        <w:tc>
+          <w:tcPr>
+            <w:tcW w:w="0" w:type="auto"/>
+            <w:tcMar>
+              <w:top w:w="30" w:type="dxa"/>
+              <w:left w:w="45" w:type="dxa"/>
+              <w:bottom w:w="30" w:type="dxa"/>
+              <w:right w:w="45" w:type="dxa"/>
+            </w:tcMar>
+            <w:vAlign w:val="bottom"/>
+            <w:hideMark/>
+          </w:tcPr>
+          <w:p>
+            <w:pPr>
+              <w:jc w:val="center"/>
+              <w:rPr>
+                <w:rFonts w:ascii="Times New Roman" w:hAnsi="Times New Roman" w:cs="Times New Roman"/>
+                <w:b/>
+                <w:bCs/>
+                <w:sz w:val="24"/>
+                <w:szCs w:val="24"/>
+              </w:rPr>
+            </w:pPr>
+            <w:r>
+              <w:rPr>
+                <w:rFonts w:ascii="Times New Roman" w:hAnsi="Times New Roman" w:cs="Times New Roman"/>
+                <w:b/>
+                <w:bCs/>
+                <w:sz w:val="24"/>
+                <w:szCs w:val="24"/>
+              </w:rPr>
+              <w:t xml:space="preserve">Waktu </w:t>
+            </w:r>
+            <w:proofErr w:type="spellStart"/>
+            <w:r>
+              <w:rPr>
+                <w:rFonts w:ascii="Times New Roman" w:hAnsi="Times New Roman" w:cs="Times New Roman"/>
+                <w:b/>
+                <w:bCs/>
+                <w:sz w:val="24"/>
+                <w:szCs w:val="24"/>
+              </w:rPr>
+              <w:t>Penyelesaian</w:t>
+            </w:r>
+            <w:proofErr w:type="spellEnd"/>
           </w:p>
         </w:tc>
       </w:tr>
@@ -485,13 +565,113 @@
                 <w:szCs w:val="24"/>
               </w:rPr>
             </w:pPr>
-            <w:r>
-              <w:rPr>
-                <w:rFonts w:ascii="Times New Roman" w:hAnsi="Times New Roman" w:cs="Times New Roman"/>
-                <w:sz w:val="24"/>
-                <w:szCs w:val="24"/>
-              </w:rPr>
-              <w:t>Memantau dashboard utama (termasuk data sensor/aktuator rentang waktu)</w:t>
+            <w:proofErr w:type="spellStart"/>
+            <w:r>
+              <w:rPr>
+                <w:rFonts w:ascii="Times New Roman" w:hAnsi="Times New Roman" w:cs="Times New Roman"/>
+                <w:sz w:val="24"/>
+                <w:szCs w:val="24"/>
+              </w:rPr>
+              <w:t>Memantau</w:t>
+            </w:r>
+            <w:proofErr w:type="spellEnd"/>
+            <w:r>
+              <w:rPr>
+                <w:rFonts w:ascii="Times New Roman" w:hAnsi="Times New Roman" w:cs="Times New Roman"/>
+                <w:sz w:val="24"/>
+                <w:szCs w:val="24"/>
+              </w:rPr>
+              <w:t xml:space="preserve"> dashboard </w:t>
+            </w:r>
+            <w:proofErr w:type="spellStart"/>
+            <w:r>
+              <w:rPr>
+                <w:rFonts w:ascii="Times New Roman" w:hAnsi="Times New Roman" w:cs="Times New Roman"/>
+                <w:sz w:val="24"/>
+                <w:szCs w:val="24"/>
+              </w:rPr>
+              <w:t>utama</w:t>
+            </w:r>
+            <w:proofErr w:type="spellEnd"/>
+            <w:r>
+              <w:rPr>
+                <w:rFonts w:ascii="Times New Roman" w:hAnsi="Times New Roman" w:cs="Times New Roman"/>
+                <w:sz w:val="24"/>
+                <w:szCs w:val="24"/>
+              </w:rPr>
+              <w:t xml:space="preserve"> (</w:t>
+            </w:r>
+            <w:proofErr w:type="spellStart"/>
+            <w:r>
+              <w:rPr>
+                <w:rFonts w:ascii="Times New Roman" w:hAnsi="Times New Roman" w:cs="Times New Roman"/>
+                <w:sz w:val="24"/>
+                <w:szCs w:val="24"/>
+              </w:rPr>
+              <w:t>termasuk</w:t>
+            </w:r>
+            <w:proofErr w:type="spellEnd"/>
+            <w:r>
+              <w:rPr>
+                <w:rFonts w:ascii="Times New Roman" w:hAnsi="Times New Roman" w:cs="Times New Roman"/>
+                <w:sz w:val="24"/>
+                <w:szCs w:val="24"/>
+              </w:rPr>
+              <w:t xml:space="preserve"> data sensor/</w:t>
+            </w:r>
+            <w:proofErr w:type="spellStart"/>
+            <w:r>
+              <w:rPr>
+                <w:rFonts w:ascii="Times New Roman" w:hAnsi="Times New Roman" w:cs="Times New Roman"/>
+                <w:sz w:val="24"/>
+                <w:szCs w:val="24"/>
+              </w:rPr>
+              <w:t>aktuator</w:t>
+            </w:r>
+            <w:proofErr w:type="spellEnd"/>
+            <w:r>
+              <w:rPr>
+                <w:rFonts w:ascii="Times New Roman" w:hAnsi="Times New Roman" w:cs="Times New Roman"/>
+                <w:sz w:val="24"/>
+                <w:szCs w:val="24"/>
+              </w:rPr>
+              <w:t xml:space="preserve"> </w:t>
+            </w:r>
+            <w:proofErr w:type="spellStart"/>
+            <w:r>
+              <w:rPr>
+                <w:rFonts w:ascii="Times New Roman" w:hAnsi="Times New Roman" w:cs="Times New Roman"/>
+                <w:sz w:val="24"/>
+                <w:szCs w:val="24"/>
+              </w:rPr>
+              <w:t>rentang</w:t>
+            </w:r>
+            <w:proofErr w:type="spellEnd"/>
+            <w:r>
+              <w:rPr>
+                <w:rFonts w:ascii="Times New Roman" w:hAnsi="Times New Roman" w:cs="Times New Roman"/>
+                <w:sz w:val="24"/>
+                <w:szCs w:val="24"/>
+              </w:rPr>
+              <w:t xml:space="preserve"> </w:t>
+            </w:r>
+            <w:proofErr w:type="spellStart"/>
+            <w:r>
+              <w:rPr>
+                <w:rFonts w:ascii="Times New Roman" w:hAnsi="Times New Roman" w:cs="Times New Roman"/>
+                <w:sz w:val="24"/>
+                <w:szCs w:val="24"/>
+              </w:rPr>
+              <w:t>waktu</w:t>
+            </w:r>
+            <w:proofErr w:type="spellEnd"/>
+            <w:r>
+              <w:rPr>
+                <w:rFonts w:ascii="Times New Roman" w:hAnsi="Times New Roman" w:cs="Times New Roman"/>
+                <w:sz w:val="24"/>
+                <w:szCs w:val="24"/>
+              </w:rPr>
+              <w:t>)</w:t>
             </w:r>
           </w:p>
         </w:tc>
@@ -616,14 +796,52 @@
                 <w:szCs w:val="24"/>
               </w:rPr>
             </w:pPr>
-            <w:r>
-              <w:rPr>
-                <w:rFonts w:ascii="Times New Roman" w:hAnsi="Times New Roman" w:cs="Times New Roman"/>
-                <w:sz w:val="24"/>
-                <w:szCs w:val="24"/>
-              </w:rPr>
-              <w:t>Melihat daftar notifikasi sistem</w:t>
-            </w:r>
+            <w:proofErr w:type="spellStart"/>
+            <w:r>
+              <w:rPr>
+                <w:rFonts w:ascii="Times New Roman" w:hAnsi="Times New Roman" w:cs="Times New Roman"/>
+                <w:sz w:val="24"/>
+                <w:szCs w:val="24"/>
+              </w:rPr>
+              <w:t>Melihat</w:t>
+            </w:r>
+            <w:proofErr w:type="spellEnd"/>
+            <w:r>
+              <w:rPr>
+                <w:rFonts w:ascii="Times New Roman" w:hAnsi="Times New Roman" w:cs="Times New Roman"/>
+                <w:sz w:val="24"/>
+                <w:szCs w:val="24"/>
+              </w:rPr>
+              <w:t xml:space="preserve"> daftar </w:t>
+            </w:r>
+            <w:proofErr w:type="spellStart"/>
+            <w:r>
+              <w:rPr>
+                <w:rFonts w:ascii="Times New Roman" w:hAnsi="Times New Roman" w:cs="Times New Roman"/>
+                <w:sz w:val="24"/>
+                <w:szCs w:val="24"/>
+              </w:rPr>
+              <w:t>notifikasi</w:t>
+            </w:r>
+            <w:proofErr w:type="spellEnd"/>
+            <w:r>
+              <w:rPr>
+                <w:rFonts w:ascii="Times New Roman" w:hAnsi="Times New Roman" w:cs="Times New Roman"/>
+                <w:sz w:val="24"/>
+                <w:szCs w:val="24"/>
+              </w:rPr>
+              <w:t xml:space="preserve"> </w:t>
+            </w:r>
+            <w:proofErr w:type="spellStart"/>
+            <w:r>
+              <w:rPr>
+                <w:rFonts w:ascii="Times New Roman" w:hAnsi="Times New Roman" w:cs="Times New Roman"/>
+                <w:sz w:val="24"/>
+                <w:szCs w:val="24"/>
+              </w:rPr>
+              <w:t>sistem</w:t>
+            </w:r>
+            <w:proofErr w:type="spellEnd"/>
           </w:p>
         </w:tc>
         <w:tc>
@@ -883,13 +1101,23 @@
                 <w:szCs w:val="24"/>
               </w:rPr>
             </w:pPr>
-            <w:r>
-              <w:rPr>
-                <w:rFonts w:ascii="Times New Roman" w:hAnsi="Times New Roman" w:cs="Times New Roman"/>
-                <w:sz w:val="24"/>
-                <w:szCs w:val="24"/>
-              </w:rPr>
-              <w:t>Melihat daftar data greenhouse/sector</w:t>
+            <w:proofErr w:type="spellStart"/>
+            <w:r>
+              <w:rPr>
+                <w:rFonts w:ascii="Times New Roman" w:hAnsi="Times New Roman" w:cs="Times New Roman"/>
+                <w:sz w:val="24"/>
+                <w:szCs w:val="24"/>
+              </w:rPr>
+              <w:t>Melihat</w:t>
+            </w:r>
+            <w:proofErr w:type="spellEnd"/>
+            <w:r>
+              <w:rPr>
+                <w:rFonts w:ascii="Times New Roman" w:hAnsi="Times New Roman" w:cs="Times New Roman"/>
+                <w:sz w:val="24"/>
+                <w:szCs w:val="24"/>
+              </w:rPr>
+              <w:t xml:space="preserve"> daftar data greenhouse/sector</w:t>
             </w:r>
           </w:p>
         </w:tc>
@@ -1014,14 +1242,34 @@
                 <w:szCs w:val="24"/>
               </w:rPr>
             </w:pPr>
-            <w:r>
-              <w:rPr>
-                <w:rFonts w:ascii="Times New Roman" w:hAnsi="Times New Roman" w:cs="Times New Roman"/>
-                <w:sz w:val="24"/>
-                <w:szCs w:val="24"/>
-              </w:rPr>
-              <w:t>Melihat detail data greenhouse tertentu</w:t>
-            </w:r>
+            <w:proofErr w:type="spellStart"/>
+            <w:r>
+              <w:rPr>
+                <w:rFonts w:ascii="Times New Roman" w:hAnsi="Times New Roman" w:cs="Times New Roman"/>
+                <w:sz w:val="24"/>
+                <w:szCs w:val="24"/>
+              </w:rPr>
+              <w:t>Melihat</w:t>
+            </w:r>
+            <w:proofErr w:type="spellEnd"/>
+            <w:r>
+              <w:rPr>
+                <w:rFonts w:ascii="Times New Roman" w:hAnsi="Times New Roman" w:cs="Times New Roman"/>
+                <w:sz w:val="24"/>
+                <w:szCs w:val="24"/>
+              </w:rPr>
+              <w:t xml:space="preserve"> detail data greenhouse </w:t>
+            </w:r>
+            <w:proofErr w:type="spellStart"/>
+            <w:r>
+              <w:rPr>
+                <w:rFonts w:ascii="Times New Roman" w:hAnsi="Times New Roman" w:cs="Times New Roman"/>
+                <w:sz w:val="24"/>
+                <w:szCs w:val="24"/>
+              </w:rPr>
+              <w:t>tertentu</w:t>
+            </w:r>
+            <w:proofErr w:type="spellEnd"/>
           </w:p>
         </w:tc>
         <w:tc>
@@ -1145,14 +1393,52 @@
                 <w:szCs w:val="24"/>
               </w:rPr>
             </w:pPr>
-            <w:r>
-              <w:rPr>
-                <w:rFonts w:ascii="Times New Roman" w:hAnsi="Times New Roman" w:cs="Times New Roman"/>
-                <w:sz w:val="24"/>
-                <w:szCs w:val="24"/>
-              </w:rPr>
-              <w:t>Melakukan penambahan data greenhouse baru</w:t>
-            </w:r>
+            <w:proofErr w:type="spellStart"/>
+            <w:r>
+              <w:rPr>
+                <w:rFonts w:ascii="Times New Roman" w:hAnsi="Times New Roman" w:cs="Times New Roman"/>
+                <w:sz w:val="24"/>
+                <w:szCs w:val="24"/>
+              </w:rPr>
+              <w:t>Melakukan</w:t>
+            </w:r>
+            <w:proofErr w:type="spellEnd"/>
+            <w:r>
+              <w:rPr>
+                <w:rFonts w:ascii="Times New Roman" w:hAnsi="Times New Roman" w:cs="Times New Roman"/>
+                <w:sz w:val="24"/>
+                <w:szCs w:val="24"/>
+              </w:rPr>
+              <w:t xml:space="preserve"> </w:t>
+            </w:r>
+            <w:proofErr w:type="spellStart"/>
+            <w:r>
+              <w:rPr>
+                <w:rFonts w:ascii="Times New Roman" w:hAnsi="Times New Roman" w:cs="Times New Roman"/>
+                <w:sz w:val="24"/>
+                <w:szCs w:val="24"/>
+              </w:rPr>
+              <w:t>penambahan</w:t>
+            </w:r>
+            <w:proofErr w:type="spellEnd"/>
+            <w:r>
+              <w:rPr>
+                <w:rFonts w:ascii="Times New Roman" w:hAnsi="Times New Roman" w:cs="Times New Roman"/>
+                <w:sz w:val="24"/>
+                <w:szCs w:val="24"/>
+              </w:rPr>
+              <w:t xml:space="preserve"> data greenhouse </w:t>
+            </w:r>
+            <w:proofErr w:type="spellStart"/>
+            <w:r>
+              <w:rPr>
+                <w:rFonts w:ascii="Times New Roman" w:hAnsi="Times New Roman" w:cs="Times New Roman"/>
+                <w:sz w:val="24"/>
+                <w:szCs w:val="24"/>
+              </w:rPr>
+              <w:t>baru</w:t>
+            </w:r>
+            <w:proofErr w:type="spellEnd"/>
           </w:p>
         </w:tc>
         <w:tc>
@@ -1276,13 +1562,41 @@
                 <w:szCs w:val="24"/>
               </w:rPr>
             </w:pPr>
-            <w:r>
-              <w:rPr>
-                <w:rFonts w:ascii="Times New Roman" w:hAnsi="Times New Roman" w:cs="Times New Roman"/>
-                <w:sz w:val="24"/>
-                <w:szCs w:val="24"/>
-              </w:rPr>
-              <w:t>Melakukan pengeditan data greenhouse</w:t>
+            <w:proofErr w:type="spellStart"/>
+            <w:r>
+              <w:rPr>
+                <w:rFonts w:ascii="Times New Roman" w:hAnsi="Times New Roman" w:cs="Times New Roman"/>
+                <w:sz w:val="24"/>
+                <w:szCs w:val="24"/>
+              </w:rPr>
+              <w:t>Melakukan</w:t>
+            </w:r>
+            <w:proofErr w:type="spellEnd"/>
+            <w:r>
+              <w:rPr>
+                <w:rFonts w:ascii="Times New Roman" w:hAnsi="Times New Roman" w:cs="Times New Roman"/>
+                <w:sz w:val="24"/>
+                <w:szCs w:val="24"/>
+              </w:rPr>
+              <w:t xml:space="preserve"> </w:t>
+            </w:r>
+            <w:proofErr w:type="spellStart"/>
+            <w:r>
+              <w:rPr>
+                <w:rFonts w:ascii="Times New Roman" w:hAnsi="Times New Roman" w:cs="Times New Roman"/>
+                <w:sz w:val="24"/>
+                <w:szCs w:val="24"/>
+              </w:rPr>
+              <w:t>pengeditan</w:t>
+            </w:r>
+            <w:proofErr w:type="spellEnd"/>
+            <w:r>
+              <w:rPr>
+                <w:rFonts w:ascii="Times New Roman" w:hAnsi="Times New Roman" w:cs="Times New Roman"/>
+                <w:sz w:val="24"/>
+                <w:szCs w:val="24"/>
+              </w:rPr>
+              <w:t xml:space="preserve"> data greenhouse</w:t>
             </w:r>
           </w:p>
         </w:tc>
@@ -1407,13 +1721,41 @@
                 <w:szCs w:val="24"/>
               </w:rPr>
             </w:pPr>
-            <w:r>
-              <w:rPr>
-                <w:rFonts w:ascii="Times New Roman" w:hAnsi="Times New Roman" w:cs="Times New Roman"/>
-                <w:sz w:val="24"/>
-                <w:szCs w:val="24"/>
-              </w:rPr>
-              <w:t>Melakukan penghapusan data greenhouse</w:t>
+            <w:proofErr w:type="spellStart"/>
+            <w:r>
+              <w:rPr>
+                <w:rFonts w:ascii="Times New Roman" w:hAnsi="Times New Roman" w:cs="Times New Roman"/>
+                <w:sz w:val="24"/>
+                <w:szCs w:val="24"/>
+              </w:rPr>
+              <w:t>Melakukan</w:t>
+            </w:r>
+            <w:proofErr w:type="spellEnd"/>
+            <w:r>
+              <w:rPr>
+                <w:rFonts w:ascii="Times New Roman" w:hAnsi="Times New Roman" w:cs="Times New Roman"/>
+                <w:sz w:val="24"/>
+                <w:szCs w:val="24"/>
+              </w:rPr>
+              <w:t xml:space="preserve"> </w:t>
+            </w:r>
+            <w:proofErr w:type="spellStart"/>
+            <w:r>
+              <w:rPr>
+                <w:rFonts w:ascii="Times New Roman" w:hAnsi="Times New Roman" w:cs="Times New Roman"/>
+                <w:sz w:val="24"/>
+                <w:szCs w:val="24"/>
+              </w:rPr>
+              <w:t>penghapusan</w:t>
+            </w:r>
+            <w:proofErr w:type="spellEnd"/>
+            <w:r>
+              <w:rPr>
+                <w:rFonts w:ascii="Times New Roman" w:hAnsi="Times New Roman" w:cs="Times New Roman"/>
+                <w:sz w:val="24"/>
+                <w:szCs w:val="24"/>
+              </w:rPr>
+              <w:t xml:space="preserve"> data greenhouse</w:t>
             </w:r>
           </w:p>
         </w:tc>
@@ -1538,13 +1880,41 @@
                 <w:szCs w:val="24"/>
               </w:rPr>
             </w:pPr>
-            <w:r>
-              <w:rPr>
-                <w:rFonts w:ascii="Times New Roman" w:hAnsi="Times New Roman" w:cs="Times New Roman"/>
-                <w:sz w:val="24"/>
-                <w:szCs w:val="24"/>
-              </w:rPr>
-              <w:t>Melihat daftar data tandon/reservoir</w:t>
+            <w:proofErr w:type="spellStart"/>
+            <w:r>
+              <w:rPr>
+                <w:rFonts w:ascii="Times New Roman" w:hAnsi="Times New Roman" w:cs="Times New Roman"/>
+                <w:sz w:val="24"/>
+                <w:szCs w:val="24"/>
+              </w:rPr>
+              <w:t>Melihat</w:t>
+            </w:r>
+            <w:proofErr w:type="spellEnd"/>
+            <w:r>
+              <w:rPr>
+                <w:rFonts w:ascii="Times New Roman" w:hAnsi="Times New Roman" w:cs="Times New Roman"/>
+                <w:sz w:val="24"/>
+                <w:szCs w:val="24"/>
+              </w:rPr>
+              <w:t xml:space="preserve"> daftar data </w:t>
+            </w:r>
+            <w:proofErr w:type="spellStart"/>
+            <w:r>
+              <w:rPr>
+                <w:rFonts w:ascii="Times New Roman" w:hAnsi="Times New Roman" w:cs="Times New Roman"/>
+                <w:sz w:val="24"/>
+                <w:szCs w:val="24"/>
+              </w:rPr>
+              <w:t>tandon</w:t>
+            </w:r>
+            <w:proofErr w:type="spellEnd"/>
+            <w:r>
+              <w:rPr>
+                <w:rFonts w:ascii="Times New Roman" w:hAnsi="Times New Roman" w:cs="Times New Roman"/>
+                <w:sz w:val="24"/>
+                <w:szCs w:val="24"/>
+              </w:rPr>
+              <w:t>/reservoir</w:t>
             </w:r>
           </w:p>
         </w:tc>
@@ -1669,14 +2039,52 @@
                 <w:szCs w:val="24"/>
               </w:rPr>
             </w:pPr>
-            <w:r>
-              <w:rPr>
-                <w:rFonts w:ascii="Times New Roman" w:hAnsi="Times New Roman" w:cs="Times New Roman"/>
-                <w:sz w:val="24"/>
-                <w:szCs w:val="24"/>
-              </w:rPr>
-              <w:t>Melihat detail data tandon/reservoir tertentu</w:t>
-            </w:r>
+            <w:proofErr w:type="spellStart"/>
+            <w:r>
+              <w:rPr>
+                <w:rFonts w:ascii="Times New Roman" w:hAnsi="Times New Roman" w:cs="Times New Roman"/>
+                <w:sz w:val="24"/>
+                <w:szCs w:val="24"/>
+              </w:rPr>
+              <w:t>Melihat</w:t>
+            </w:r>
+            <w:proofErr w:type="spellEnd"/>
+            <w:r>
+              <w:rPr>
+                <w:rFonts w:ascii="Times New Roman" w:hAnsi="Times New Roman" w:cs="Times New Roman"/>
+                <w:sz w:val="24"/>
+                <w:szCs w:val="24"/>
+              </w:rPr>
+              <w:t xml:space="preserve"> detail data </w:t>
+            </w:r>
+            <w:proofErr w:type="spellStart"/>
+            <w:r>
+              <w:rPr>
+                <w:rFonts w:ascii="Times New Roman" w:hAnsi="Times New Roman" w:cs="Times New Roman"/>
+                <w:sz w:val="24"/>
+                <w:szCs w:val="24"/>
+              </w:rPr>
+              <w:t>tandon</w:t>
+            </w:r>
+            <w:proofErr w:type="spellEnd"/>
+            <w:r>
+              <w:rPr>
+                <w:rFonts w:ascii="Times New Roman" w:hAnsi="Times New Roman" w:cs="Times New Roman"/>
+                <w:sz w:val="24"/>
+                <w:szCs w:val="24"/>
+              </w:rPr>
+              <w:t xml:space="preserve">/reservoir </w:t>
+            </w:r>
+            <w:proofErr w:type="spellStart"/>
+            <w:r>
+              <w:rPr>
+                <w:rFonts w:ascii="Times New Roman" w:hAnsi="Times New Roman" w:cs="Times New Roman"/>
+                <w:sz w:val="24"/>
+                <w:szCs w:val="24"/>
+              </w:rPr>
+              <w:t>tertentu</w:t>
+            </w:r>
+            <w:proofErr w:type="spellEnd"/>
           </w:p>
         </w:tc>
         <w:tc>
@@ -1936,13 +2344,59 @@
                 <w:szCs w:val="24"/>
               </w:rPr>
             </w:pPr>
-            <w:r>
-              <w:rPr>
-                <w:rFonts w:ascii="Times New Roman" w:hAnsi="Times New Roman" w:cs="Times New Roman"/>
-                <w:sz w:val="24"/>
-                <w:szCs w:val="24"/>
-              </w:rPr>
-              <w:t>Melakukan pengeditan data tandon/reservoir</w:t>
+            <w:proofErr w:type="spellStart"/>
+            <w:r>
+              <w:rPr>
+                <w:rFonts w:ascii="Times New Roman" w:hAnsi="Times New Roman" w:cs="Times New Roman"/>
+                <w:sz w:val="24"/>
+                <w:szCs w:val="24"/>
+              </w:rPr>
+              <w:t>Melakukan</w:t>
+            </w:r>
+            <w:proofErr w:type="spellEnd"/>
+            <w:r>
+              <w:rPr>
+                <w:rFonts w:ascii="Times New Roman" w:hAnsi="Times New Roman" w:cs="Times New Roman"/>
+                <w:sz w:val="24"/>
+                <w:szCs w:val="24"/>
+              </w:rPr>
+              <w:t xml:space="preserve"> </w:t>
+            </w:r>
+            <w:proofErr w:type="spellStart"/>
+            <w:r>
+              <w:rPr>
+                <w:rFonts w:ascii="Times New Roman" w:hAnsi="Times New Roman" w:cs="Times New Roman"/>
+                <w:sz w:val="24"/>
+                <w:szCs w:val="24"/>
+              </w:rPr>
+              <w:t>pengeditan</w:t>
+            </w:r>
+            <w:proofErr w:type="spellEnd"/>
+            <w:r>
+              <w:rPr>
+                <w:rFonts w:ascii="Times New Roman" w:hAnsi="Times New Roman" w:cs="Times New Roman"/>
+                <w:sz w:val="24"/>
+                <w:szCs w:val="24"/>
+              </w:rPr>
+              <w:t xml:space="preserve"> data </w:t>
+            </w:r>
+            <w:proofErr w:type="spellStart"/>
+            <w:r>
+              <w:rPr>
+                <w:rFonts w:ascii="Times New Roman" w:hAnsi="Times New Roman" w:cs="Times New Roman"/>
+                <w:sz w:val="24"/>
+                <w:szCs w:val="24"/>
+              </w:rPr>
+              <w:t>tandon</w:t>
+            </w:r>
+            <w:proofErr w:type="spellEnd"/>
+            <w:r>
+              <w:rPr>
+                <w:rFonts w:ascii="Times New Roman" w:hAnsi="Times New Roman" w:cs="Times New Roman"/>
+                <w:sz w:val="24"/>
+                <w:szCs w:val="24"/>
+              </w:rPr>
+              <w:t>/reservoir</w:t>
             </w:r>
           </w:p>
         </w:tc>
@@ -2067,13 +2521,59 @@
                 <w:szCs w:val="24"/>
               </w:rPr>
             </w:pPr>
-            <w:r>
-              <w:rPr>
-                <w:rFonts w:ascii="Times New Roman" w:hAnsi="Times New Roman" w:cs="Times New Roman"/>
-                <w:sz w:val="24"/>
-                <w:szCs w:val="24"/>
-              </w:rPr>
-              <w:t>Melakukan penghapusan data tandon/reservoir</w:t>
+            <w:proofErr w:type="spellStart"/>
+            <w:r>
+              <w:rPr>
+                <w:rFonts w:ascii="Times New Roman" w:hAnsi="Times New Roman" w:cs="Times New Roman"/>
+                <w:sz w:val="24"/>
+                <w:szCs w:val="24"/>
+              </w:rPr>
+              <w:t>Melakukan</w:t>
+            </w:r>
+            <w:proofErr w:type="spellEnd"/>
+            <w:r>
+              <w:rPr>
+                <w:rFonts w:ascii="Times New Roman" w:hAnsi="Times New Roman" w:cs="Times New Roman"/>
+                <w:sz w:val="24"/>
+                <w:szCs w:val="24"/>
+              </w:rPr>
+              <w:t xml:space="preserve"> </w:t>
+            </w:r>
+            <w:proofErr w:type="spellStart"/>
+            <w:r>
+              <w:rPr>
+                <w:rFonts w:ascii="Times New Roman" w:hAnsi="Times New Roman" w:cs="Times New Roman"/>
+                <w:sz w:val="24"/>
+                <w:szCs w:val="24"/>
+              </w:rPr>
+              <w:t>penghapusan</w:t>
+            </w:r>
+            <w:proofErr w:type="spellEnd"/>
+            <w:r>
+              <w:rPr>
+                <w:rFonts w:ascii="Times New Roman" w:hAnsi="Times New Roman" w:cs="Times New Roman"/>
+                <w:sz w:val="24"/>
+                <w:szCs w:val="24"/>
+              </w:rPr>
+              <w:t xml:space="preserve"> data </w:t>
+            </w:r>
+            <w:proofErr w:type="spellStart"/>
+            <w:r>
+              <w:rPr>
+                <w:rFonts w:ascii="Times New Roman" w:hAnsi="Times New Roman" w:cs="Times New Roman"/>
+                <w:sz w:val="24"/>
+                <w:szCs w:val="24"/>
+              </w:rPr>
+              <w:t>tandon</w:t>
+            </w:r>
+            <w:proofErr w:type="spellEnd"/>
+            <w:r>
+              <w:rPr>
+                <w:rFonts w:ascii="Times New Roman" w:hAnsi="Times New Roman" w:cs="Times New Roman"/>
+                <w:sz w:val="24"/>
+                <w:szCs w:val="24"/>
+              </w:rPr>
+              <w:t>/reservoir</w:t>
             </w:r>
           </w:p>
         </w:tc>
@@ -2198,13 +2698,23 @@
                 <w:szCs w:val="24"/>
               </w:rPr>
             </w:pPr>
-            <w:r>
-              <w:rPr>
-                <w:rFonts w:ascii="Times New Roman" w:hAnsi="Times New Roman" w:cs="Times New Roman"/>
-                <w:sz w:val="24"/>
-                <w:szCs w:val="24"/>
-              </w:rPr>
-              <w:t>Melihat daftar data robot</w:t>
+            <w:proofErr w:type="spellStart"/>
+            <w:r>
+              <w:rPr>
+                <w:rFonts w:ascii="Times New Roman" w:hAnsi="Times New Roman" w:cs="Times New Roman"/>
+                <w:sz w:val="24"/>
+                <w:szCs w:val="24"/>
+              </w:rPr>
+              <w:t>Melihat</w:t>
+            </w:r>
+            <w:proofErr w:type="spellEnd"/>
+            <w:r>
+              <w:rPr>
+                <w:rFonts w:ascii="Times New Roman" w:hAnsi="Times New Roman" w:cs="Times New Roman"/>
+                <w:sz w:val="24"/>
+                <w:szCs w:val="24"/>
+              </w:rPr>
+              <w:t xml:space="preserve"> daftar data robot</w:t>
             </w:r>
           </w:p>
         </w:tc>
@@ -2329,14 +2839,34 @@
                 <w:szCs w:val="24"/>
               </w:rPr>
             </w:pPr>
-            <w:r>
-              <w:rPr>
-                <w:rFonts w:ascii="Times New Roman" w:hAnsi="Times New Roman" w:cs="Times New Roman"/>
-                <w:sz w:val="24"/>
-                <w:szCs w:val="24"/>
-              </w:rPr>
-              <w:t>Melihat detail data robot tertentu</w:t>
-            </w:r>
+            <w:proofErr w:type="spellStart"/>
+            <w:r>
+              <w:rPr>
+                <w:rFonts w:ascii="Times New Roman" w:hAnsi="Times New Roman" w:cs="Times New Roman"/>
+                <w:sz w:val="24"/>
+                <w:szCs w:val="24"/>
+              </w:rPr>
+              <w:t>Melihat</w:t>
+            </w:r>
+            <w:proofErr w:type="spellEnd"/>
+            <w:r>
+              <w:rPr>
+                <w:rFonts w:ascii="Times New Roman" w:hAnsi="Times New Roman" w:cs="Times New Roman"/>
+                <w:sz w:val="24"/>
+                <w:szCs w:val="24"/>
+              </w:rPr>
+              <w:t xml:space="preserve"> detail data robot </w:t>
+            </w:r>
+            <w:proofErr w:type="spellStart"/>
+            <w:r>
+              <w:rPr>
+                <w:rFonts w:ascii="Times New Roman" w:hAnsi="Times New Roman" w:cs="Times New Roman"/>
+                <w:sz w:val="24"/>
+                <w:szCs w:val="24"/>
+              </w:rPr>
+              <w:t>tertentu</w:t>
+            </w:r>
+            <w:proofErr w:type="spellEnd"/>
           </w:p>
         </w:tc>
         <w:tc>
@@ -2596,13 +3126,41 @@
                 <w:szCs w:val="24"/>
               </w:rPr>
             </w:pPr>
-            <w:r>
-              <w:rPr>
-                <w:rFonts w:ascii="Times New Roman" w:hAnsi="Times New Roman" w:cs="Times New Roman"/>
-                <w:sz w:val="24"/>
-                <w:szCs w:val="24"/>
-              </w:rPr>
-              <w:t>Melakukan pengeditan data robot</w:t>
+            <w:proofErr w:type="spellStart"/>
+            <w:r>
+              <w:rPr>
+                <w:rFonts w:ascii="Times New Roman" w:hAnsi="Times New Roman" w:cs="Times New Roman"/>
+                <w:sz w:val="24"/>
+                <w:szCs w:val="24"/>
+              </w:rPr>
+              <w:t>Melakukan</w:t>
+            </w:r>
+            <w:proofErr w:type="spellEnd"/>
+            <w:r>
+              <w:rPr>
+                <w:rFonts w:ascii="Times New Roman" w:hAnsi="Times New Roman" w:cs="Times New Roman"/>
+                <w:sz w:val="24"/>
+                <w:szCs w:val="24"/>
+              </w:rPr>
+              <w:t xml:space="preserve"> </w:t>
+            </w:r>
+            <w:proofErr w:type="spellStart"/>
+            <w:r>
+              <w:rPr>
+                <w:rFonts w:ascii="Times New Roman" w:hAnsi="Times New Roman" w:cs="Times New Roman"/>
+                <w:sz w:val="24"/>
+                <w:szCs w:val="24"/>
+              </w:rPr>
+              <w:t>pengeditan</w:t>
+            </w:r>
+            <w:proofErr w:type="spellEnd"/>
+            <w:r>
+              <w:rPr>
+                <w:rFonts w:ascii="Times New Roman" w:hAnsi="Times New Roman" w:cs="Times New Roman"/>
+                <w:sz w:val="24"/>
+                <w:szCs w:val="24"/>
+              </w:rPr>
+              <w:t xml:space="preserve"> data robot</w:t>
             </w:r>
           </w:p>
         </w:tc>
@@ -2728,13 +3286,41 @@
                 <w:szCs w:val="24"/>
               </w:rPr>
             </w:pPr>
-            <w:r>
-              <w:rPr>
-                <w:rFonts w:ascii="Times New Roman" w:hAnsi="Times New Roman" w:cs="Times New Roman"/>
-                <w:sz w:val="24"/>
-                <w:szCs w:val="24"/>
-              </w:rPr>
-              <w:t>Melakukan penghapusan data robot</w:t>
+            <w:proofErr w:type="spellStart"/>
+            <w:r>
+              <w:rPr>
+                <w:rFonts w:ascii="Times New Roman" w:hAnsi="Times New Roman" w:cs="Times New Roman"/>
+                <w:sz w:val="24"/>
+                <w:szCs w:val="24"/>
+              </w:rPr>
+              <w:t>Melakukan</w:t>
+            </w:r>
+            <w:proofErr w:type="spellEnd"/>
+            <w:r>
+              <w:rPr>
+                <w:rFonts w:ascii="Times New Roman" w:hAnsi="Times New Roman" w:cs="Times New Roman"/>
+                <w:sz w:val="24"/>
+                <w:szCs w:val="24"/>
+              </w:rPr>
+              <w:t xml:space="preserve"> </w:t>
+            </w:r>
+            <w:proofErr w:type="spellStart"/>
+            <w:r>
+              <w:rPr>
+                <w:rFonts w:ascii="Times New Roman" w:hAnsi="Times New Roman" w:cs="Times New Roman"/>
+                <w:sz w:val="24"/>
+                <w:szCs w:val="24"/>
+              </w:rPr>
+              <w:t>penghapusan</w:t>
+            </w:r>
+            <w:proofErr w:type="spellEnd"/>
+            <w:r>
+              <w:rPr>
+                <w:rFonts w:ascii="Times New Roman" w:hAnsi="Times New Roman" w:cs="Times New Roman"/>
+                <w:sz w:val="24"/>
+                <w:szCs w:val="24"/>
+              </w:rPr>
+              <w:t xml:space="preserve"> data robot</w:t>
             </w:r>
           </w:p>
         </w:tc>
@@ -2859,13 +3445,23 @@
                 <w:szCs w:val="24"/>
               </w:rPr>
             </w:pPr>
-            <w:r>
-              <w:rPr>
-                <w:rFonts w:ascii="Times New Roman" w:hAnsi="Times New Roman" w:cs="Times New Roman"/>
-                <w:sz w:val="24"/>
-                <w:szCs w:val="24"/>
-              </w:rPr>
-              <w:t>Melihat data monitoring sensor</w:t>
+            <w:proofErr w:type="spellStart"/>
+            <w:r>
+              <w:rPr>
+                <w:rFonts w:ascii="Times New Roman" w:hAnsi="Times New Roman" w:cs="Times New Roman"/>
+                <w:sz w:val="24"/>
+                <w:szCs w:val="24"/>
+              </w:rPr>
+              <w:t>Melihat</w:t>
+            </w:r>
+            <w:proofErr w:type="spellEnd"/>
+            <w:r>
+              <w:rPr>
+                <w:rFonts w:ascii="Times New Roman" w:hAnsi="Times New Roman" w:cs="Times New Roman"/>
+                <w:sz w:val="24"/>
+                <w:szCs w:val="24"/>
+              </w:rPr>
+              <w:t xml:space="preserve"> data monitoring sensor</w:t>
             </w:r>
           </w:p>
         </w:tc>
@@ -2990,14 +3586,34 @@
                 <w:szCs w:val="24"/>
               </w:rPr>
             </w:pPr>
-            <w:r>
-              <w:rPr>
-                <w:rFonts w:ascii="Times New Roman" w:hAnsi="Times New Roman" w:cs="Times New Roman"/>
-                <w:sz w:val="24"/>
-                <w:szCs w:val="24"/>
-              </w:rPr>
-              <w:t>Melihat detail data sensor tertentu</w:t>
-            </w:r>
+            <w:proofErr w:type="spellStart"/>
+            <w:r>
+              <w:rPr>
+                <w:rFonts w:ascii="Times New Roman" w:hAnsi="Times New Roman" w:cs="Times New Roman"/>
+                <w:sz w:val="24"/>
+                <w:szCs w:val="24"/>
+              </w:rPr>
+              <w:t>Melihat</w:t>
+            </w:r>
+            <w:proofErr w:type="spellEnd"/>
+            <w:r>
+              <w:rPr>
+                <w:rFonts w:ascii="Times New Roman" w:hAnsi="Times New Roman" w:cs="Times New Roman"/>
+                <w:sz w:val="24"/>
+                <w:szCs w:val="24"/>
+              </w:rPr>
+              <w:t xml:space="preserve"> detail data sensor </w:t>
+            </w:r>
+            <w:proofErr w:type="spellStart"/>
+            <w:r>
+              <w:rPr>
+                <w:rFonts w:ascii="Times New Roman" w:hAnsi="Times New Roman" w:cs="Times New Roman"/>
+                <w:sz w:val="24"/>
+                <w:szCs w:val="24"/>
+              </w:rPr>
+              <w:t>tertentu</w:t>
+            </w:r>
+            <w:proofErr w:type="spellEnd"/>
           </w:p>
         </w:tc>
         <w:tc>
@@ -3393,13 +4009,41 @@
                 <w:szCs w:val="24"/>
               </w:rPr>
             </w:pPr>
-            <w:r>
-              <w:rPr>
-                <w:rFonts w:ascii="Times New Roman" w:hAnsi="Times New Roman" w:cs="Times New Roman"/>
-                <w:sz w:val="24"/>
-                <w:szCs w:val="24"/>
-              </w:rPr>
-              <w:t>Melakukan pengeditan data sensor</w:t>
+            <w:proofErr w:type="spellStart"/>
+            <w:r>
+              <w:rPr>
+                <w:rFonts w:ascii="Times New Roman" w:hAnsi="Times New Roman" w:cs="Times New Roman"/>
+                <w:sz w:val="24"/>
+                <w:szCs w:val="24"/>
+              </w:rPr>
+              <w:t>Melakukan</w:t>
+            </w:r>
+            <w:proofErr w:type="spellEnd"/>
+            <w:r>
+              <w:rPr>
+                <w:rFonts w:ascii="Times New Roman" w:hAnsi="Times New Roman" w:cs="Times New Roman"/>
+                <w:sz w:val="24"/>
+                <w:szCs w:val="24"/>
+              </w:rPr>
+              <w:t xml:space="preserve"> </w:t>
+            </w:r>
+            <w:proofErr w:type="spellStart"/>
+            <w:r>
+              <w:rPr>
+                <w:rFonts w:ascii="Times New Roman" w:hAnsi="Times New Roman" w:cs="Times New Roman"/>
+                <w:sz w:val="24"/>
+                <w:szCs w:val="24"/>
+              </w:rPr>
+              <w:t>pengeditan</w:t>
+            </w:r>
+            <w:proofErr w:type="spellEnd"/>
+            <w:r>
+              <w:rPr>
+                <w:rFonts w:ascii="Times New Roman" w:hAnsi="Times New Roman" w:cs="Times New Roman"/>
+                <w:sz w:val="24"/>
+                <w:szCs w:val="24"/>
+              </w:rPr>
+              <w:t xml:space="preserve"> data sensor</w:t>
             </w:r>
           </w:p>
         </w:tc>
@@ -3524,13 +4168,41 @@
                 <w:szCs w:val="24"/>
               </w:rPr>
             </w:pPr>
-            <w:r>
-              <w:rPr>
-                <w:rFonts w:ascii="Times New Roman" w:hAnsi="Times New Roman" w:cs="Times New Roman"/>
-                <w:sz w:val="24"/>
-                <w:szCs w:val="24"/>
-              </w:rPr>
-              <w:t>Melakukan penghapusan data sensor</w:t>
+            <w:proofErr w:type="spellStart"/>
+            <w:r>
+              <w:rPr>
+                <w:rFonts w:ascii="Times New Roman" w:hAnsi="Times New Roman" w:cs="Times New Roman"/>
+                <w:sz w:val="24"/>
+                <w:szCs w:val="24"/>
+              </w:rPr>
+              <w:t>Melakukan</w:t>
+            </w:r>
+            <w:proofErr w:type="spellEnd"/>
+            <w:r>
+              <w:rPr>
+                <w:rFonts w:ascii="Times New Roman" w:hAnsi="Times New Roman" w:cs="Times New Roman"/>
+                <w:sz w:val="24"/>
+                <w:szCs w:val="24"/>
+              </w:rPr>
+              <w:t xml:space="preserve"> </w:t>
+            </w:r>
+            <w:proofErr w:type="spellStart"/>
+            <w:r>
+              <w:rPr>
+                <w:rFonts w:ascii="Times New Roman" w:hAnsi="Times New Roman" w:cs="Times New Roman"/>
+                <w:sz w:val="24"/>
+                <w:szCs w:val="24"/>
+              </w:rPr>
+              <w:t>penghapusan</w:t>
+            </w:r>
+            <w:proofErr w:type="spellEnd"/>
+            <w:r>
+              <w:rPr>
+                <w:rFonts w:ascii="Times New Roman" w:hAnsi="Times New Roman" w:cs="Times New Roman"/>
+                <w:sz w:val="24"/>
+                <w:szCs w:val="24"/>
+              </w:rPr>
+              <w:t xml:space="preserve"> data sensor</w:t>
             </w:r>
           </w:p>
         </w:tc>
@@ -3655,14 +4327,34 @@
                 <w:szCs w:val="24"/>
               </w:rPr>
             </w:pPr>
-            <w:r>
-              <w:rPr>
-                <w:rFonts w:ascii="Times New Roman" w:hAnsi="Times New Roman" w:cs="Times New Roman"/>
-                <w:sz w:val="24"/>
-                <w:szCs w:val="24"/>
-              </w:rPr>
-              <w:t>Melihat data controlling aktuator</w:t>
-            </w:r>
+            <w:proofErr w:type="spellStart"/>
+            <w:r>
+              <w:rPr>
+                <w:rFonts w:ascii="Times New Roman" w:hAnsi="Times New Roman" w:cs="Times New Roman"/>
+                <w:sz w:val="24"/>
+                <w:szCs w:val="24"/>
+              </w:rPr>
+              <w:t>Melihat</w:t>
+            </w:r>
+            <w:proofErr w:type="spellEnd"/>
+            <w:r>
+              <w:rPr>
+                <w:rFonts w:ascii="Times New Roman" w:hAnsi="Times New Roman" w:cs="Times New Roman"/>
+                <w:sz w:val="24"/>
+                <w:szCs w:val="24"/>
+              </w:rPr>
+              <w:t xml:space="preserve"> data controlling </w:t>
+            </w:r>
+            <w:proofErr w:type="spellStart"/>
+            <w:r>
+              <w:rPr>
+                <w:rFonts w:ascii="Times New Roman" w:hAnsi="Times New Roman" w:cs="Times New Roman"/>
+                <w:sz w:val="24"/>
+                <w:szCs w:val="24"/>
+              </w:rPr>
+              <w:t>aktuator</w:t>
+            </w:r>
+            <w:proofErr w:type="spellEnd"/>
           </w:p>
         </w:tc>
         <w:tc>
@@ -3786,14 +4478,52 @@
                 <w:szCs w:val="24"/>
               </w:rPr>
             </w:pPr>
-            <w:r>
-              <w:rPr>
-                <w:rFonts w:ascii="Times New Roman" w:hAnsi="Times New Roman" w:cs="Times New Roman"/>
-                <w:sz w:val="24"/>
-                <w:szCs w:val="24"/>
-              </w:rPr>
-              <w:t>Melihat detail data aktuator tertentu</w:t>
-            </w:r>
+            <w:proofErr w:type="spellStart"/>
+            <w:r>
+              <w:rPr>
+                <w:rFonts w:ascii="Times New Roman" w:hAnsi="Times New Roman" w:cs="Times New Roman"/>
+                <w:sz w:val="24"/>
+                <w:szCs w:val="24"/>
+              </w:rPr>
+              <w:t>Melihat</w:t>
+            </w:r>
+            <w:proofErr w:type="spellEnd"/>
+            <w:r>
+              <w:rPr>
+                <w:rFonts w:ascii="Times New Roman" w:hAnsi="Times New Roman" w:cs="Times New Roman"/>
+                <w:sz w:val="24"/>
+                <w:szCs w:val="24"/>
+              </w:rPr>
+              <w:t xml:space="preserve"> detail data </w:t>
+            </w:r>
+            <w:proofErr w:type="spellStart"/>
+            <w:r>
+              <w:rPr>
+                <w:rFonts w:ascii="Times New Roman" w:hAnsi="Times New Roman" w:cs="Times New Roman"/>
+                <w:sz w:val="24"/>
+                <w:szCs w:val="24"/>
+              </w:rPr>
+              <w:t>aktuator</w:t>
+            </w:r>
+            <w:proofErr w:type="spellEnd"/>
+            <w:r>
+              <w:rPr>
+                <w:rFonts w:ascii="Times New Roman" w:hAnsi="Times New Roman" w:cs="Times New Roman"/>
+                <w:sz w:val="24"/>
+                <w:szCs w:val="24"/>
+              </w:rPr>
+              <w:t xml:space="preserve"> </w:t>
+            </w:r>
+            <w:proofErr w:type="spellStart"/>
+            <w:r>
+              <w:rPr>
+                <w:rFonts w:ascii="Times New Roman" w:hAnsi="Times New Roman" w:cs="Times New Roman"/>
+                <w:sz w:val="24"/>
+                <w:szCs w:val="24"/>
+              </w:rPr>
+              <w:t>tertentu</w:t>
+            </w:r>
+            <w:proofErr w:type="spellEnd"/>
           </w:p>
         </w:tc>
         <w:tc>
@@ -4053,14 +4783,70 @@
                 <w:szCs w:val="24"/>
               </w:rPr>
             </w:pPr>
-            <w:r>
-              <w:rPr>
-                <w:rFonts w:ascii="Times New Roman" w:hAnsi="Times New Roman" w:cs="Times New Roman"/>
-                <w:sz w:val="24"/>
-                <w:szCs w:val="24"/>
-              </w:rPr>
-              <w:t>Mengaktifkan (menyalakan) aktuator tertentu</w:t>
-            </w:r>
+            <w:proofErr w:type="spellStart"/>
+            <w:r>
+              <w:rPr>
+                <w:rFonts w:ascii="Times New Roman" w:hAnsi="Times New Roman" w:cs="Times New Roman"/>
+                <w:sz w:val="24"/>
+                <w:szCs w:val="24"/>
+              </w:rPr>
+              <w:t>Mengaktifkan</w:t>
+            </w:r>
+            <w:proofErr w:type="spellEnd"/>
+            <w:r>
+              <w:rPr>
+                <w:rFonts w:ascii="Times New Roman" w:hAnsi="Times New Roman" w:cs="Times New Roman"/>
+                <w:sz w:val="24"/>
+                <w:szCs w:val="24"/>
+              </w:rPr>
+              <w:t xml:space="preserve"> (</w:t>
+            </w:r>
+            <w:proofErr w:type="spellStart"/>
+            <w:r>
+              <w:rPr>
+                <w:rFonts w:ascii="Times New Roman" w:hAnsi="Times New Roman" w:cs="Times New Roman"/>
+                <w:sz w:val="24"/>
+                <w:szCs w:val="24"/>
+              </w:rPr>
+              <w:t>menyalakan</w:t>
+            </w:r>
+            <w:proofErr w:type="spellEnd"/>
+            <w:r>
+              <w:rPr>
+                <w:rFonts w:ascii="Times New Roman" w:hAnsi="Times New Roman" w:cs="Times New Roman"/>
+                <w:sz w:val="24"/>
+                <w:szCs w:val="24"/>
+              </w:rPr>
+              <w:t xml:space="preserve">) </w:t>
+            </w:r>
+            <w:proofErr w:type="spellStart"/>
+            <w:r>
+              <w:rPr>
+                <w:rFonts w:ascii="Times New Roman" w:hAnsi="Times New Roman" w:cs="Times New Roman"/>
+                <w:sz w:val="24"/>
+                <w:szCs w:val="24"/>
+              </w:rPr>
+              <w:t>aktuator</w:t>
+            </w:r>
+            <w:proofErr w:type="spellEnd"/>
+            <w:r>
+              <w:rPr>
+                <w:rFonts w:ascii="Times New Roman" w:hAnsi="Times New Roman" w:cs="Times New Roman"/>
+                <w:sz w:val="24"/>
+                <w:szCs w:val="24"/>
+              </w:rPr>
+              <w:t xml:space="preserve"> </w:t>
+            </w:r>
+            <w:proofErr w:type="spellStart"/>
+            <w:r>
+              <w:rPr>
+                <w:rFonts w:ascii="Times New Roman" w:hAnsi="Times New Roman" w:cs="Times New Roman"/>
+                <w:sz w:val="24"/>
+                <w:szCs w:val="24"/>
+              </w:rPr>
+              <w:t>tertentu</w:t>
+            </w:r>
+            <w:proofErr w:type="spellEnd"/>
           </w:p>
         </w:tc>
         <w:tc>
@@ -4320,14 +5106,52 @@
                 <w:szCs w:val="24"/>
               </w:rPr>
             </w:pPr>
-            <w:r>
-              <w:rPr>
-                <w:rFonts w:ascii="Times New Roman" w:hAnsi="Times New Roman" w:cs="Times New Roman"/>
-                <w:sz w:val="24"/>
-                <w:szCs w:val="24"/>
-              </w:rPr>
-              <w:t>Melakukan pengeditan data aktuator</w:t>
-            </w:r>
+            <w:proofErr w:type="spellStart"/>
+            <w:r>
+              <w:rPr>
+                <w:rFonts w:ascii="Times New Roman" w:hAnsi="Times New Roman" w:cs="Times New Roman"/>
+                <w:sz w:val="24"/>
+                <w:szCs w:val="24"/>
+              </w:rPr>
+              <w:t>Melakukan</w:t>
+            </w:r>
+            <w:proofErr w:type="spellEnd"/>
+            <w:r>
+              <w:rPr>
+                <w:rFonts w:ascii="Times New Roman" w:hAnsi="Times New Roman" w:cs="Times New Roman"/>
+                <w:sz w:val="24"/>
+                <w:szCs w:val="24"/>
+              </w:rPr>
+              <w:t xml:space="preserve"> </w:t>
+            </w:r>
+            <w:proofErr w:type="spellStart"/>
+            <w:r>
+              <w:rPr>
+                <w:rFonts w:ascii="Times New Roman" w:hAnsi="Times New Roman" w:cs="Times New Roman"/>
+                <w:sz w:val="24"/>
+                <w:szCs w:val="24"/>
+              </w:rPr>
+              <w:t>pengeditan</w:t>
+            </w:r>
+            <w:proofErr w:type="spellEnd"/>
+            <w:r>
+              <w:rPr>
+                <w:rFonts w:ascii="Times New Roman" w:hAnsi="Times New Roman" w:cs="Times New Roman"/>
+                <w:sz w:val="24"/>
+                <w:szCs w:val="24"/>
+              </w:rPr>
+              <w:t xml:space="preserve"> data </w:t>
+            </w:r>
+            <w:proofErr w:type="spellStart"/>
+            <w:r>
+              <w:rPr>
+                <w:rFonts w:ascii="Times New Roman" w:hAnsi="Times New Roman" w:cs="Times New Roman"/>
+                <w:sz w:val="24"/>
+                <w:szCs w:val="24"/>
+              </w:rPr>
+              <w:t>aktuator</w:t>
+            </w:r>
+            <w:proofErr w:type="spellEnd"/>
           </w:p>
         </w:tc>
         <w:tc>
@@ -4451,14 +5275,52 @@
                 <w:szCs w:val="24"/>
               </w:rPr>
             </w:pPr>
-            <w:r>
-              <w:rPr>
-                <w:rFonts w:ascii="Times New Roman" w:hAnsi="Times New Roman" w:cs="Times New Roman"/>
-                <w:sz w:val="24"/>
-                <w:szCs w:val="24"/>
-              </w:rPr>
-              <w:t>Melakukan penghapusan data aktuator</w:t>
-            </w:r>
+            <w:proofErr w:type="spellStart"/>
+            <w:r>
+              <w:rPr>
+                <w:rFonts w:ascii="Times New Roman" w:hAnsi="Times New Roman" w:cs="Times New Roman"/>
+                <w:sz w:val="24"/>
+                <w:szCs w:val="24"/>
+              </w:rPr>
+              <w:t>Melakukan</w:t>
+            </w:r>
+            <w:proofErr w:type="spellEnd"/>
+            <w:r>
+              <w:rPr>
+                <w:rFonts w:ascii="Times New Roman" w:hAnsi="Times New Roman" w:cs="Times New Roman"/>
+                <w:sz w:val="24"/>
+                <w:szCs w:val="24"/>
+              </w:rPr>
+              <w:t xml:space="preserve"> </w:t>
+            </w:r>
+            <w:proofErr w:type="spellStart"/>
+            <w:r>
+              <w:rPr>
+                <w:rFonts w:ascii="Times New Roman" w:hAnsi="Times New Roman" w:cs="Times New Roman"/>
+                <w:sz w:val="24"/>
+                <w:szCs w:val="24"/>
+              </w:rPr>
+              <w:t>penghapusan</w:t>
+            </w:r>
+            <w:proofErr w:type="spellEnd"/>
+            <w:r>
+              <w:rPr>
+                <w:rFonts w:ascii="Times New Roman" w:hAnsi="Times New Roman" w:cs="Times New Roman"/>
+                <w:sz w:val="24"/>
+                <w:szCs w:val="24"/>
+              </w:rPr>
+              <w:t xml:space="preserve"> data </w:t>
+            </w:r>
+            <w:proofErr w:type="spellStart"/>
+            <w:r>
+              <w:rPr>
+                <w:rFonts w:ascii="Times New Roman" w:hAnsi="Times New Roman" w:cs="Times New Roman"/>
+                <w:sz w:val="24"/>
+                <w:szCs w:val="24"/>
+              </w:rPr>
+              <w:t>aktuator</w:t>
+            </w:r>
+            <w:proofErr w:type="spellEnd"/>
           </w:p>
         </w:tc>
         <w:tc>
@@ -4582,13 +5444,41 @@
                 <w:szCs w:val="24"/>
               </w:rPr>
             </w:pPr>
-            <w:r>
-              <w:rPr>
-                <w:rFonts w:ascii="Times New Roman" w:hAnsi="Times New Roman" w:cs="Times New Roman"/>
-                <w:sz w:val="24"/>
-                <w:szCs w:val="24"/>
-              </w:rPr>
-              <w:t>Melihat data automation berbasis sensor</w:t>
+            <w:proofErr w:type="spellStart"/>
+            <w:r>
+              <w:rPr>
+                <w:rFonts w:ascii="Times New Roman" w:hAnsi="Times New Roman" w:cs="Times New Roman"/>
+                <w:sz w:val="24"/>
+                <w:szCs w:val="24"/>
+              </w:rPr>
+              <w:t>Melihat</w:t>
+            </w:r>
+            <w:proofErr w:type="spellEnd"/>
+            <w:r>
+              <w:rPr>
+                <w:rFonts w:ascii="Times New Roman" w:hAnsi="Times New Roman" w:cs="Times New Roman"/>
+                <w:sz w:val="24"/>
+                <w:szCs w:val="24"/>
+              </w:rPr>
+              <w:t xml:space="preserve"> data automation </w:t>
+            </w:r>
+            <w:proofErr w:type="spellStart"/>
+            <w:r>
+              <w:rPr>
+                <w:rFonts w:ascii="Times New Roman" w:hAnsi="Times New Roman" w:cs="Times New Roman"/>
+                <w:sz w:val="24"/>
+                <w:szCs w:val="24"/>
+              </w:rPr>
+              <w:t>berbasis</w:t>
+            </w:r>
+            <w:proofErr w:type="spellEnd"/>
+            <w:r>
+              <w:rPr>
+                <w:rFonts w:ascii="Times New Roman" w:hAnsi="Times New Roman" w:cs="Times New Roman"/>
+                <w:sz w:val="24"/>
+                <w:szCs w:val="24"/>
+              </w:rPr>
+              <w:t xml:space="preserve"> sensor</w:t>
             </w:r>
           </w:p>
         </w:tc>
@@ -4713,13 +5603,41 @@
                 <w:szCs w:val="24"/>
               </w:rPr>
             </w:pPr>
-            <w:r>
-              <w:rPr>
-                <w:rFonts w:ascii="Times New Roman" w:hAnsi="Times New Roman" w:cs="Times New Roman"/>
-                <w:sz w:val="24"/>
-                <w:szCs w:val="24"/>
-              </w:rPr>
-              <w:t>Melakukan penambahan data automation sensor</w:t>
+            <w:proofErr w:type="spellStart"/>
+            <w:r>
+              <w:rPr>
+                <w:rFonts w:ascii="Times New Roman" w:hAnsi="Times New Roman" w:cs="Times New Roman"/>
+                <w:sz w:val="24"/>
+                <w:szCs w:val="24"/>
+              </w:rPr>
+              <w:t>Melakukan</w:t>
+            </w:r>
+            <w:proofErr w:type="spellEnd"/>
+            <w:r>
+              <w:rPr>
+                <w:rFonts w:ascii="Times New Roman" w:hAnsi="Times New Roman" w:cs="Times New Roman"/>
+                <w:sz w:val="24"/>
+                <w:szCs w:val="24"/>
+              </w:rPr>
+              <w:t xml:space="preserve"> </w:t>
+            </w:r>
+            <w:proofErr w:type="spellStart"/>
+            <w:r>
+              <w:rPr>
+                <w:rFonts w:ascii="Times New Roman" w:hAnsi="Times New Roman" w:cs="Times New Roman"/>
+                <w:sz w:val="24"/>
+                <w:szCs w:val="24"/>
+              </w:rPr>
+              <w:t>penambahan</w:t>
+            </w:r>
+            <w:proofErr w:type="spellEnd"/>
+            <w:r>
+              <w:rPr>
+                <w:rFonts w:ascii="Times New Roman" w:hAnsi="Times New Roman" w:cs="Times New Roman"/>
+                <w:sz w:val="24"/>
+                <w:szCs w:val="24"/>
+              </w:rPr>
+              <w:t xml:space="preserve"> data automation sensor</w:t>
             </w:r>
           </w:p>
         </w:tc>
@@ -4844,13 +5762,41 @@
                 <w:szCs w:val="24"/>
               </w:rPr>
             </w:pPr>
-            <w:r>
-              <w:rPr>
-                <w:rFonts w:ascii="Times New Roman" w:hAnsi="Times New Roman" w:cs="Times New Roman"/>
-                <w:sz w:val="24"/>
-                <w:szCs w:val="24"/>
-              </w:rPr>
-              <w:t>Melakukan pengeditan data automation sensor</w:t>
+            <w:proofErr w:type="spellStart"/>
+            <w:r>
+              <w:rPr>
+                <w:rFonts w:ascii="Times New Roman" w:hAnsi="Times New Roman" w:cs="Times New Roman"/>
+                <w:sz w:val="24"/>
+                <w:szCs w:val="24"/>
+              </w:rPr>
+              <w:t>Melakukan</w:t>
+            </w:r>
+            <w:proofErr w:type="spellEnd"/>
+            <w:r>
+              <w:rPr>
+                <w:rFonts w:ascii="Times New Roman" w:hAnsi="Times New Roman" w:cs="Times New Roman"/>
+                <w:sz w:val="24"/>
+                <w:szCs w:val="24"/>
+              </w:rPr>
+              <w:t xml:space="preserve"> </w:t>
+            </w:r>
+            <w:proofErr w:type="spellStart"/>
+            <w:r>
+              <w:rPr>
+                <w:rFonts w:ascii="Times New Roman" w:hAnsi="Times New Roman" w:cs="Times New Roman"/>
+                <w:sz w:val="24"/>
+                <w:szCs w:val="24"/>
+              </w:rPr>
+              <w:t>pengeditan</w:t>
+            </w:r>
+            <w:proofErr w:type="spellEnd"/>
+            <w:r>
+              <w:rPr>
+                <w:rFonts w:ascii="Times New Roman" w:hAnsi="Times New Roman" w:cs="Times New Roman"/>
+                <w:sz w:val="24"/>
+                <w:szCs w:val="24"/>
+              </w:rPr>
+              <w:t xml:space="preserve"> data automation sensor</w:t>
             </w:r>
           </w:p>
         </w:tc>
@@ -4975,13 +5921,41 @@
                 <w:szCs w:val="24"/>
               </w:rPr>
             </w:pPr>
-            <w:r>
-              <w:rPr>
-                <w:rFonts w:ascii="Times New Roman" w:hAnsi="Times New Roman" w:cs="Times New Roman"/>
-                <w:sz w:val="24"/>
-                <w:szCs w:val="24"/>
-              </w:rPr>
-              <w:t>Melakukan penghapusan data automation sensor</w:t>
+            <w:proofErr w:type="spellStart"/>
+            <w:r>
+              <w:rPr>
+                <w:rFonts w:ascii="Times New Roman" w:hAnsi="Times New Roman" w:cs="Times New Roman"/>
+                <w:sz w:val="24"/>
+                <w:szCs w:val="24"/>
+              </w:rPr>
+              <w:t>Melakukan</w:t>
+            </w:r>
+            <w:proofErr w:type="spellEnd"/>
+            <w:r>
+              <w:rPr>
+                <w:rFonts w:ascii="Times New Roman" w:hAnsi="Times New Roman" w:cs="Times New Roman"/>
+                <w:sz w:val="24"/>
+                <w:szCs w:val="24"/>
+              </w:rPr>
+              <w:t xml:space="preserve"> </w:t>
+            </w:r>
+            <w:proofErr w:type="spellStart"/>
+            <w:r>
+              <w:rPr>
+                <w:rFonts w:ascii="Times New Roman" w:hAnsi="Times New Roman" w:cs="Times New Roman"/>
+                <w:sz w:val="24"/>
+                <w:szCs w:val="24"/>
+              </w:rPr>
+              <w:t>penghapusan</w:t>
+            </w:r>
+            <w:proofErr w:type="spellEnd"/>
+            <w:r>
+              <w:rPr>
+                <w:rFonts w:ascii="Times New Roman" w:hAnsi="Times New Roman" w:cs="Times New Roman"/>
+                <w:sz w:val="24"/>
+                <w:szCs w:val="24"/>
+              </w:rPr>
+              <w:t xml:space="preserve"> data automation sensor</w:t>
             </w:r>
           </w:p>
         </w:tc>
@@ -5242,14 +6216,52 @@
                 <w:szCs w:val="24"/>
               </w:rPr>
             </w:pPr>
-            <w:r>
-              <w:rPr>
-                <w:rFonts w:ascii="Times New Roman" w:hAnsi="Times New Roman" w:cs="Times New Roman"/>
-                <w:sz w:val="24"/>
-                <w:szCs w:val="24"/>
-              </w:rPr>
-              <w:t>Melihat data automation berbasis jadwal</w:t>
-            </w:r>
+            <w:proofErr w:type="spellStart"/>
+            <w:r>
+              <w:rPr>
+                <w:rFonts w:ascii="Times New Roman" w:hAnsi="Times New Roman" w:cs="Times New Roman"/>
+                <w:sz w:val="24"/>
+                <w:szCs w:val="24"/>
+              </w:rPr>
+              <w:t>Melihat</w:t>
+            </w:r>
+            <w:proofErr w:type="spellEnd"/>
+            <w:r>
+              <w:rPr>
+                <w:rFonts w:ascii="Times New Roman" w:hAnsi="Times New Roman" w:cs="Times New Roman"/>
+                <w:sz w:val="24"/>
+                <w:szCs w:val="24"/>
+              </w:rPr>
+              <w:t xml:space="preserve"> data automation </w:t>
+            </w:r>
+            <w:proofErr w:type="spellStart"/>
+            <w:r>
+              <w:rPr>
+                <w:rFonts w:ascii="Times New Roman" w:hAnsi="Times New Roman" w:cs="Times New Roman"/>
+                <w:sz w:val="24"/>
+                <w:szCs w:val="24"/>
+              </w:rPr>
+              <w:t>berbasis</w:t>
+            </w:r>
+            <w:proofErr w:type="spellEnd"/>
+            <w:r>
+              <w:rPr>
+                <w:rFonts w:ascii="Times New Roman" w:hAnsi="Times New Roman" w:cs="Times New Roman"/>
+                <w:sz w:val="24"/>
+                <w:szCs w:val="24"/>
+              </w:rPr>
+              <w:t xml:space="preserve"> </w:t>
+            </w:r>
+            <w:proofErr w:type="spellStart"/>
+            <w:r>
+              <w:rPr>
+                <w:rFonts w:ascii="Times New Roman" w:hAnsi="Times New Roman" w:cs="Times New Roman"/>
+                <w:sz w:val="24"/>
+                <w:szCs w:val="24"/>
+              </w:rPr>
+              <w:t>jadwal</w:t>
+            </w:r>
+            <w:proofErr w:type="spellEnd"/>
           </w:p>
         </w:tc>
         <w:tc>
@@ -5374,14 +6386,52 @@
                 <w:szCs w:val="24"/>
               </w:rPr>
             </w:pPr>
-            <w:r>
-              <w:rPr>
-                <w:rFonts w:ascii="Times New Roman" w:hAnsi="Times New Roman" w:cs="Times New Roman"/>
-                <w:sz w:val="24"/>
-                <w:szCs w:val="24"/>
-              </w:rPr>
-              <w:t>Melakukan penambahan data automation jadwal</w:t>
-            </w:r>
+            <w:proofErr w:type="spellStart"/>
+            <w:r>
+              <w:rPr>
+                <w:rFonts w:ascii="Times New Roman" w:hAnsi="Times New Roman" w:cs="Times New Roman"/>
+                <w:sz w:val="24"/>
+                <w:szCs w:val="24"/>
+              </w:rPr>
+              <w:t>Melakukan</w:t>
+            </w:r>
+            <w:proofErr w:type="spellEnd"/>
+            <w:r>
+              <w:rPr>
+                <w:rFonts w:ascii="Times New Roman" w:hAnsi="Times New Roman" w:cs="Times New Roman"/>
+                <w:sz w:val="24"/>
+                <w:szCs w:val="24"/>
+              </w:rPr>
+              <w:t xml:space="preserve"> </w:t>
+            </w:r>
+            <w:proofErr w:type="spellStart"/>
+            <w:r>
+              <w:rPr>
+                <w:rFonts w:ascii="Times New Roman" w:hAnsi="Times New Roman" w:cs="Times New Roman"/>
+                <w:sz w:val="24"/>
+                <w:szCs w:val="24"/>
+              </w:rPr>
+              <w:t>penambahan</w:t>
+            </w:r>
+            <w:proofErr w:type="spellEnd"/>
+            <w:r>
+              <w:rPr>
+                <w:rFonts w:ascii="Times New Roman" w:hAnsi="Times New Roman" w:cs="Times New Roman"/>
+                <w:sz w:val="24"/>
+                <w:szCs w:val="24"/>
+              </w:rPr>
+              <w:t xml:space="preserve"> data automation </w:t>
+            </w:r>
+            <w:proofErr w:type="spellStart"/>
+            <w:r>
+              <w:rPr>
+                <w:rFonts w:ascii="Times New Roman" w:hAnsi="Times New Roman" w:cs="Times New Roman"/>
+                <w:sz w:val="24"/>
+                <w:szCs w:val="24"/>
+              </w:rPr>
+              <w:t>jadwal</w:t>
+            </w:r>
+            <w:proofErr w:type="spellEnd"/>
           </w:p>
         </w:tc>
         <w:tc>
@@ -5505,14 +6555,52 @@
                 <w:szCs w:val="24"/>
               </w:rPr>
             </w:pPr>
-            <w:r>
-              <w:rPr>
-                <w:rFonts w:ascii="Times New Roman" w:hAnsi="Times New Roman" w:cs="Times New Roman"/>
-                <w:sz w:val="24"/>
-                <w:szCs w:val="24"/>
-              </w:rPr>
-              <w:t>Melakukan pengeditan data automation jadwal</w:t>
-            </w:r>
+            <w:proofErr w:type="spellStart"/>
+            <w:r>
+              <w:rPr>
+                <w:rFonts w:ascii="Times New Roman" w:hAnsi="Times New Roman" w:cs="Times New Roman"/>
+                <w:sz w:val="24"/>
+                <w:szCs w:val="24"/>
+              </w:rPr>
+              <w:t>Melakukan</w:t>
+            </w:r>
+            <w:proofErr w:type="spellEnd"/>
+            <w:r>
+              <w:rPr>
+                <w:rFonts w:ascii="Times New Roman" w:hAnsi="Times New Roman" w:cs="Times New Roman"/>
+                <w:sz w:val="24"/>
+                <w:szCs w:val="24"/>
+              </w:rPr>
+              <w:t xml:space="preserve"> </w:t>
+            </w:r>
+            <w:proofErr w:type="spellStart"/>
+            <w:r>
+              <w:rPr>
+                <w:rFonts w:ascii="Times New Roman" w:hAnsi="Times New Roman" w:cs="Times New Roman"/>
+                <w:sz w:val="24"/>
+                <w:szCs w:val="24"/>
+              </w:rPr>
+              <w:t>pengeditan</w:t>
+            </w:r>
+            <w:proofErr w:type="spellEnd"/>
+            <w:r>
+              <w:rPr>
+                <w:rFonts w:ascii="Times New Roman" w:hAnsi="Times New Roman" w:cs="Times New Roman"/>
+                <w:sz w:val="24"/>
+                <w:szCs w:val="24"/>
+              </w:rPr>
+              <w:t xml:space="preserve"> data automation </w:t>
+            </w:r>
+            <w:proofErr w:type="spellStart"/>
+            <w:r>
+              <w:rPr>
+                <w:rFonts w:ascii="Times New Roman" w:hAnsi="Times New Roman" w:cs="Times New Roman"/>
+                <w:sz w:val="24"/>
+                <w:szCs w:val="24"/>
+              </w:rPr>
+              <w:t>jadwal</w:t>
+            </w:r>
+            <w:proofErr w:type="spellEnd"/>
           </w:p>
         </w:tc>
         <w:tc>
@@ -5636,14 +6724,52 @@
                 <w:szCs w:val="24"/>
               </w:rPr>
             </w:pPr>
-            <w:r>
-              <w:rPr>
-                <w:rFonts w:ascii="Times New Roman" w:hAnsi="Times New Roman" w:cs="Times New Roman"/>
-                <w:sz w:val="24"/>
-                <w:szCs w:val="24"/>
-              </w:rPr>
-              <w:t>Melakukan penghapusan data automation jadwal</w:t>
-            </w:r>
+            <w:proofErr w:type="spellStart"/>
+            <w:r>
+              <w:rPr>
+                <w:rFonts w:ascii="Times New Roman" w:hAnsi="Times New Roman" w:cs="Times New Roman"/>
+                <w:sz w:val="24"/>
+                <w:szCs w:val="24"/>
+              </w:rPr>
+              <w:t>Melakukan</w:t>
+            </w:r>
+            <w:proofErr w:type="spellEnd"/>
+            <w:r>
+              <w:rPr>
+                <w:rFonts w:ascii="Times New Roman" w:hAnsi="Times New Roman" w:cs="Times New Roman"/>
+                <w:sz w:val="24"/>
+                <w:szCs w:val="24"/>
+              </w:rPr>
+              <w:t xml:space="preserve"> </w:t>
+            </w:r>
+            <w:proofErr w:type="spellStart"/>
+            <w:r>
+              <w:rPr>
+                <w:rFonts w:ascii="Times New Roman" w:hAnsi="Times New Roman" w:cs="Times New Roman"/>
+                <w:sz w:val="24"/>
+                <w:szCs w:val="24"/>
+              </w:rPr>
+              <w:t>penghapusan</w:t>
+            </w:r>
+            <w:proofErr w:type="spellEnd"/>
+            <w:r>
+              <w:rPr>
+                <w:rFonts w:ascii="Times New Roman" w:hAnsi="Times New Roman" w:cs="Times New Roman"/>
+                <w:sz w:val="24"/>
+                <w:szCs w:val="24"/>
+              </w:rPr>
+              <w:t xml:space="preserve"> data automation </w:t>
+            </w:r>
+            <w:proofErr w:type="spellStart"/>
+            <w:r>
+              <w:rPr>
+                <w:rFonts w:ascii="Times New Roman" w:hAnsi="Times New Roman" w:cs="Times New Roman"/>
+                <w:sz w:val="24"/>
+                <w:szCs w:val="24"/>
+              </w:rPr>
+              <w:t>jadwal</w:t>
+            </w:r>
+            <w:proofErr w:type="spellEnd"/>
           </w:p>
         </w:tc>
         <w:tc>
@@ -5903,14 +7029,34 @@
                 <w:szCs w:val="24"/>
               </w:rPr>
             </w:pPr>
-            <w:r>
-              <w:rPr>
-                <w:rFonts w:ascii="Times New Roman" w:hAnsi="Times New Roman" w:cs="Times New Roman"/>
-                <w:sz w:val="24"/>
-                <w:szCs w:val="24"/>
-              </w:rPr>
-              <w:t>Mengunduh (download) data sensor/aktuator</w:t>
-            </w:r>
+            <w:proofErr w:type="spellStart"/>
+            <w:r>
+              <w:rPr>
+                <w:rFonts w:ascii="Times New Roman" w:hAnsi="Times New Roman" w:cs="Times New Roman"/>
+                <w:sz w:val="24"/>
+                <w:szCs w:val="24"/>
+              </w:rPr>
+              <w:t>Mengunduh</w:t>
+            </w:r>
+            <w:proofErr w:type="spellEnd"/>
+            <w:r>
+              <w:rPr>
+                <w:rFonts w:ascii="Times New Roman" w:hAnsi="Times New Roman" w:cs="Times New Roman"/>
+                <w:sz w:val="24"/>
+                <w:szCs w:val="24"/>
+              </w:rPr>
+              <w:t xml:space="preserve"> (download) data sensor/</w:t>
+            </w:r>
+            <w:proofErr w:type="spellStart"/>
+            <w:r>
+              <w:rPr>
+                <w:rFonts w:ascii="Times New Roman" w:hAnsi="Times New Roman" w:cs="Times New Roman"/>
+                <w:sz w:val="24"/>
+                <w:szCs w:val="24"/>
+              </w:rPr>
+              <w:t>aktuator</w:t>
+            </w:r>
+            <w:proofErr w:type="spellEnd"/>
           </w:p>
         </w:tc>
         <w:tc>
@@ -6034,14 +7180,52 @@
                 <w:szCs w:val="24"/>
               </w:rPr>
             </w:pPr>
-            <w:r>
-              <w:rPr>
-                <w:rFonts w:ascii="Times New Roman" w:hAnsi="Times New Roman" w:cs="Times New Roman"/>
-                <w:sz w:val="24"/>
-                <w:szCs w:val="24"/>
-              </w:rPr>
-              <w:t>Mengubah data profil pengguna</w:t>
-            </w:r>
+            <w:proofErr w:type="spellStart"/>
+            <w:r>
+              <w:rPr>
+                <w:rFonts w:ascii="Times New Roman" w:hAnsi="Times New Roman" w:cs="Times New Roman"/>
+                <w:sz w:val="24"/>
+                <w:szCs w:val="24"/>
+              </w:rPr>
+              <w:t>Mengubah</w:t>
+            </w:r>
+            <w:proofErr w:type="spellEnd"/>
+            <w:r>
+              <w:rPr>
+                <w:rFonts w:ascii="Times New Roman" w:hAnsi="Times New Roman" w:cs="Times New Roman"/>
+                <w:sz w:val="24"/>
+                <w:szCs w:val="24"/>
+              </w:rPr>
+              <w:t xml:space="preserve"> data </w:t>
+            </w:r>
+            <w:proofErr w:type="spellStart"/>
+            <w:r>
+              <w:rPr>
+                <w:rFonts w:ascii="Times New Roman" w:hAnsi="Times New Roman" w:cs="Times New Roman"/>
+                <w:sz w:val="24"/>
+                <w:szCs w:val="24"/>
+              </w:rPr>
+              <w:t>profil</w:t>
+            </w:r>
+            <w:proofErr w:type="spellEnd"/>
+            <w:r>
+              <w:rPr>
+                <w:rFonts w:ascii="Times New Roman" w:hAnsi="Times New Roman" w:cs="Times New Roman"/>
+                <w:sz w:val="24"/>
+                <w:szCs w:val="24"/>
+              </w:rPr>
+              <w:t xml:space="preserve"> </w:t>
+            </w:r>
+            <w:proofErr w:type="spellStart"/>
+            <w:r>
+              <w:rPr>
+                <w:rFonts w:ascii="Times New Roman" w:hAnsi="Times New Roman" w:cs="Times New Roman"/>
+                <w:sz w:val="24"/>
+                <w:szCs w:val="24"/>
+              </w:rPr>
+              <w:t>pengguna</w:t>
+            </w:r>
+            <w:proofErr w:type="spellEnd"/>
           </w:p>
         </w:tc>
         <w:tc>
@@ -6165,13 +7349,41 @@
                 <w:szCs w:val="24"/>
               </w:rPr>
             </w:pPr>
-            <w:r>
-              <w:rPr>
-                <w:rFonts w:ascii="Times New Roman" w:hAnsi="Times New Roman" w:cs="Times New Roman"/>
-                <w:sz w:val="24"/>
-                <w:szCs w:val="24"/>
-              </w:rPr>
-              <w:t>Memperbarui kata sandi (password)</w:t>
+            <w:proofErr w:type="spellStart"/>
+            <w:r>
+              <w:rPr>
+                <w:rFonts w:ascii="Times New Roman" w:hAnsi="Times New Roman" w:cs="Times New Roman"/>
+                <w:sz w:val="24"/>
+                <w:szCs w:val="24"/>
+              </w:rPr>
+              <w:t>Memperbarui</w:t>
+            </w:r>
+            <w:proofErr w:type="spellEnd"/>
+            <w:r>
+              <w:rPr>
+                <w:rFonts w:ascii="Times New Roman" w:hAnsi="Times New Roman" w:cs="Times New Roman"/>
+                <w:sz w:val="24"/>
+                <w:szCs w:val="24"/>
+              </w:rPr>
+              <w:t xml:space="preserve"> kata </w:t>
+            </w:r>
+            <w:proofErr w:type="spellStart"/>
+            <w:r>
+              <w:rPr>
+                <w:rFonts w:ascii="Times New Roman" w:hAnsi="Times New Roman" w:cs="Times New Roman"/>
+                <w:sz w:val="24"/>
+                <w:szCs w:val="24"/>
+              </w:rPr>
+              <w:t>sandi</w:t>
+            </w:r>
+            <w:proofErr w:type="spellEnd"/>
+            <w:r>
+              <w:rPr>
+                <w:rFonts w:ascii="Times New Roman" w:hAnsi="Times New Roman" w:cs="Times New Roman"/>
+                <w:sz w:val="24"/>
+                <w:szCs w:val="24"/>
+              </w:rPr>
+              <w:t xml:space="preserve"> (password)</w:t>
             </w:r>
           </w:p>
         </w:tc>
@@ -6550,6 +7762,65 @@
               <w:t>Apa keluhan selama menggunakan aplikasi?</w:t>
             </w:r>
           </w:p>
+          <w:p>
+            <w:pPr>
+              <w:rPr>
+                <w:rFonts w:ascii="Times New Roman" w:hAnsi="Times New Roman" w:cs="Times New Roman"/>
+                <w:sz w:val="24"/>
+                <w:szCs w:val="24"/>
+                <w:lang w:val="sv-SE"/>
+              </w:rPr>
+            </w:pPr>
+            <w:r>
+              <w:rPr>
+                <w:rFonts w:ascii="Times New Roman" w:hAnsi="Times New Roman" w:cs="Times New Roman"/>
+                <w:sz w:val="24"/>
+                <w:szCs w:val="24"/>
+                <w:lang w:val="sv-SE"/>
+              </w:rPr>
+              <w:t>Jawaban:</w:t>
+            </w:r>
+          </w:p>
+          <w:p>
+            <w:pPr>
+              <w:rPr>
+                <w:rFonts w:ascii="Times New Roman" w:hAnsi="Times New Roman" w:cs="Times New Roman"/>
+                <w:sz w:val="24"/>
+                <w:szCs w:val="24"/>
+                <w:lang w:val="sv-SE"/>
+              </w:rPr>
+            </w:pPr>
+          </w:p>
+          <w:p>
+            <w:pPr>
+              <w:rPr>
+                <w:rFonts w:ascii="Times New Roman" w:hAnsi="Times New Roman" w:cs="Times New Roman"/>
+                <w:sz w:val="24"/>
+                <w:szCs w:val="24"/>
+                <w:lang w:val="sv-SE"/>
+              </w:rPr>
+            </w:pPr>
+          </w:p>
+          <w:p>
+            <w:pPr>
+              <w:rPr>
+                <w:rFonts w:ascii="Times New Roman" w:hAnsi="Times New Roman" w:cs="Times New Roman"/>
+                <w:sz w:val="24"/>
+                <w:szCs w:val="24"/>
+                <w:lang w:val="sv-SE"/>
+              </w:rPr>
+            </w:pPr>
+          </w:p>
+          <w:p>
+            <w:pPr>
+              <w:rPr>
+                <w:rFonts w:ascii="Times New Roman" w:hAnsi="Times New Roman" w:cs="Times New Roman"/>
+                <w:sz w:val="24"/>
+                <w:szCs w:val="24"/>
+                <w:lang w:val="sv-SE"/>
+              </w:rPr>
+            </w:pPr>
+          </w:p>
         </w:tc>
       </w:tr>
       <w:tr>
@@ -6587,6 +7858,55 @@
               </w:rPr>
               <w:t>Apakah ada masukan atau saran terkait fitur, font, tata letak, navigasi, atau pewarnaan tampilan pada dashboard?</w:t>
             </w:r>
+          </w:p>
+          <w:p>
+            <w:pPr>
+              <w:rPr>
+                <w:rFonts w:ascii="Times New Roman" w:hAnsi="Times New Roman" w:cs="Times New Roman"/>
+                <w:sz w:val="24"/>
+                <w:szCs w:val="24"/>
+                <w:lang w:val="sv-SE"/>
+              </w:rPr>
+            </w:pPr>
+            <w:r>
+              <w:rPr>
+                <w:rFonts w:ascii="Times New Roman" w:hAnsi="Times New Roman" w:cs="Times New Roman"/>
+                <w:sz w:val="24"/>
+                <w:szCs w:val="24"/>
+                <w:lang w:val="sv-SE"/>
+              </w:rPr>
+              <w:t>Jawaban:</w:t>
+            </w:r>
+          </w:p>
+          <w:p>
+            <w:pPr>
+              <w:rPr>
+                <w:rFonts w:ascii="Times New Roman" w:hAnsi="Times New Roman" w:cs="Times New Roman"/>
+                <w:sz w:val="24"/>
+                <w:szCs w:val="24"/>
+                <w:lang w:val="sv-SE"/>
+              </w:rPr>
+            </w:pPr>
+          </w:p>
+          <w:p>
+            <w:pPr>
+              <w:rPr>
+                <w:rFonts w:ascii="Times New Roman" w:hAnsi="Times New Roman" w:cs="Times New Roman"/>
+                <w:sz w:val="24"/>
+                <w:szCs w:val="24"/>
+                <w:lang w:val="sv-SE"/>
+              </w:rPr>
+            </w:pPr>
+          </w:p>
+          <w:p>
+            <w:pPr>
+              <w:rPr>
+                <w:rFonts w:ascii="Times New Roman" w:hAnsi="Times New Roman" w:cs="Times New Roman"/>
+                <w:sz w:val="24"/>
+                <w:szCs w:val="24"/>
+                <w:lang w:val="sv-SE"/>
+              </w:rPr>
+            </w:pPr>
           </w:p>
         </w:tc>
       </w:tr>

</xml_diff>